<commit_message>
fixed P01 and P02 no single character variables
</commit_message>
<xml_diff>
--- a/guide_builder/P01_Gamepad_Lights_Guide.docx
+++ b/guide_builder/P01_Gamepad_Lights_Guide.docx
@@ -133,7 +133,7 @@
         <w:spacing w:after="120" w:before="260"/>
       </w:pPr>
       <w:r>
-        <w:t xml:space="preserve">1. You type the code yourself</w:t>
+        <w:t xml:space="preserve">You type the code yourself</w:t>
       </w:r>
     </w:p>
     <w:p>
@@ -179,7 +179,7 @@
         <w:spacing w:after="120" w:before="260"/>
       </w:pPr>
       <w:r>
-        <w:t xml:space="preserve">2. Blocks</w:t>
+        <w:t xml:space="preserve">Blocks</w:t>
       </w:r>
     </w:p>
     <w:p>
@@ -440,7 +440,7 @@
         <w:spacing w:after="120" w:before="260"/>
       </w:pPr>
       <w:r>
-        <w:t xml:space="preserve">3. Setting up</w:t>
+        <w:t xml:space="preserve">Setting up</w:t>
       </w:r>
     </w:p>
     <w:p>
@@ -756,7 +756,7 @@
         <w:spacing w:after="120" w:before="260"/>
       </w:pPr>
       <w:r>
-        <w:t xml:space="preserve">4. The main loop</w:t>
+        <w:t xml:space="preserve">The main loop</w:t>
       </w:r>
     </w:p>
     <w:p>
@@ -1002,7 +1002,7 @@
         <w:spacing w:after="120" w:before="260"/>
       </w:pPr>
       <w:r>
-        <w:t xml:space="preserve">5. Ask the gamepad for fresh data</w:t>
+        <w:t xml:space="preserve">Ask the gamepad for fresh data</w:t>
       </w:r>
     </w:p>
     <w:p>
@@ -1114,7 +1114,7 @@
         <w:spacing w:after="120" w:before="260"/>
       </w:pPr>
       <w:r>
-        <w:t xml:space="preserve">6. Making choices</w:t>
+        <w:t xml:space="preserve">Making choices</w:t>
       </w:r>
     </w:p>
     <w:p>
@@ -1419,7 +1419,7 @@
         <w:spacing w:after="120" w:before="260"/>
       </w:pPr>
       <w:r>
-        <w:t xml:space="preserve">7. Mixing colors</w:t>
+        <w:t xml:space="preserve">Mixing colors</w:t>
       </w:r>
     </w:p>
     <w:p>
@@ -1610,7 +1610,7 @@
         <w:spacing w:after="120" w:before="260"/>
       </w:pPr>
       <w:r>
-        <w:t xml:space="preserve">8. The finally block</w:t>
+        <w:t xml:space="preserve">The finally block</w:t>
       </w:r>
     </w:p>
     <w:p>
@@ -2087,7 +2087,7 @@
           <w:sz w:val="22"/>
           <w:szCs w:val="22"/>
         </w:rPr>
-        <w:t xml:space="preserve">This is the chain from section 6, with buttons instead of temperatures. It asks four questions in order and only one of them wins:</w:t>
+        <w:t xml:space="preserve">This is the chain from Making choices, with buttons instead of temperatures. It asks four questions in order and only one of them wins:</w:t>
       </w:r>
     </w:p>
     <w:p>
@@ -2741,7 +2741,7 @@
           <w:sz w:val="22"/>
           <w:szCs w:val="22"/>
         </w:rPr>
-        <w:t xml:space="preserve">There is one checkoff. You run your finished file once and it shows everything you built. Nothing gets erased or commented out along the way. You get 19 points for doing the work, or 20 if you did the flex. Late work is your points times 0.9. A missing robot or a missing worksheet is a 0 and a redo. This class is self-paced, so work as fast as you want, but watch the due dates. Finish all fourteen projects and you unlock the Lego and servo bin.</w:t>
+        <w:t xml:space="preserve">One checkoff. Run the finished file once and it shows everything you built, so nothing gets commented out along the way. The work is 19 points, the flex is 20, undone is 0. Late is your points × 0.9. No robot or no worksheet is a 0 and a redo. Work at your own speed and watch the due dates. Finish all fourteen and the Lego and servo bin unlocks.</w:t>
       </w:r>
     </w:p>
     <w:p>
@@ -2818,21 +2818,6 @@
           <w:szCs w:val="22"/>
         </w:rPr>
         <w:t xml:space="preserve"> to flip between two colors while you hold the button. Your call.</w:t>
-      </w:r>
-    </w:p>
-    <w:p>
-      <w:pPr>
-        <w:spacing w:before="400"/>
-      </w:pPr>
-      <w:r>
-        <w:rPr>
-          <w:i/>
-          <w:iCs/>
-          <w:color w:val="808080"/>
-          <w:sz w:val="18"/>
-          <w:szCs w:val="18"/>
-        </w:rPr>
-        <w:t xml:space="preserve">V08</w:t>
       </w:r>
     </w:p>
     <w:sectPr>
@@ -2933,7 +2918,7 @@
               <w:sz w:val="17"/>
               <w:szCs w:val="17"/>
             </w:rPr>
-            <w:t xml:space="preserve">Project 01: Gamepad Lights  ·  V08</w:t>
+            <w:t xml:space="preserve">Project 01: Gamepad Lights  ·  V09</w:t>
           </w:r>
         </w:p>
       </w:tc>

</xml_diff>

<commit_message>
now with () after functions
</commit_message>
<xml_diff>
--- a/guide_builder/P01_Gamepad_Lights_Guide.docx
+++ b/guide_builder/P01_Gamepad_Lights_Guide.docx
@@ -880,7 +880,7 @@
           <w:sz w:val="19"/>
           <w:szCs w:val="19"/>
         </w:rPr>
-        <w:t xml:space="preserve">held</w:t>
+        <w:t xml:space="preserve">held()</w:t>
       </w:r>
       <w:r>
         <w:rPr>
@@ -985,7 +985,7 @@
           <w:sz w:val="19"/>
           <w:szCs w:val="19"/>
         </w:rPr>
-        <w:t xml:space="preserve">held</w:t>
+        <w:t xml:space="preserve">held()</w:t>
       </w:r>
       <w:r>
         <w:rPr>
@@ -2425,7 +2425,7 @@
           <w:sz w:val="19"/>
           <w:szCs w:val="19"/>
         </w:rPr>
-        <w:t xml:space="preserve">set_color</w:t>
+        <w:t xml:space="preserve">set_color()</w:t>
       </w:r>
       <w:r>
         <w:rPr>
@@ -2918,7 +2918,7 @@
               <w:sz w:val="17"/>
               <w:szCs w:val="17"/>
             </w:rPr>
-            <w:t xml:space="preserve">Project 01: Gamepad Lights  ·  V09</w:t>
+            <w:t xml:space="preserve">Project 01: Gamepad Lights  ·  V10</w:t>
           </w:r>
         </w:p>
       </w:tc>

</xml_diff>